<commit_message>
Finalize r3tards NFT transparency audit
</commit_message>
<xml_diff>
--- a/r3tards-transparency.docx
+++ b/r3tards-transparency.docx
@@ -144,10 +144,11 @@
               <w:bottom w:type="dxa" w:w="50"/>
               <w:right w:type="dxa" w:w="120"/>
             </w:tcMar>
-          </w:tcPr>
-          <w:p>
-            <w:pPr>
-              <w:jc w:val="right"/>
+            <w:vAlign w:val="center"/>
+          </w:tcPr>
+          <w:p>
+            <w:pPr>
+              <w:jc w:val="center"/>
             </w:pPr>
             <w:r>
               <w:rPr>
@@ -175,6 +176,7 @@
               <w:bottom w:type="dxa" w:w="50"/>
               <w:right w:type="dxa" w:w="0"/>
             </w:tcMar>
+            <w:vAlign w:val="center"/>
           </w:tcPr>
           <w:p>
             <w:r>
@@ -205,10 +207,11 @@
               <w:bottom w:type="dxa" w:w="50"/>
               <w:right w:type="dxa" w:w="120"/>
             </w:tcMar>
-          </w:tcPr>
-          <w:p>
-            <w:pPr>
-              <w:jc w:val="right"/>
+            <w:vAlign w:val="center"/>
+          </w:tcPr>
+          <w:p>
+            <w:pPr>
+              <w:jc w:val="center"/>
             </w:pPr>
             <w:r>
               <w:rPr>
@@ -236,6 +239,7 @@
               <w:bottom w:type="dxa" w:w="50"/>
               <w:right w:type="dxa" w:w="0"/>
             </w:tcMar>
+            <w:vAlign w:val="center"/>
           </w:tcPr>
           <w:p>
             <w:r>
@@ -266,10 +270,11 @@
               <w:bottom w:type="dxa" w:w="50"/>
               <w:right w:type="dxa" w:w="120"/>
             </w:tcMar>
-          </w:tcPr>
-          <w:p>
-            <w:pPr>
-              <w:jc w:val="right"/>
+            <w:vAlign w:val="center"/>
+          </w:tcPr>
+          <w:p>
+            <w:pPr>
+              <w:jc w:val="center"/>
             </w:pPr>
             <w:r>
               <w:rPr>
@@ -297,6 +302,7 @@
               <w:bottom w:type="dxa" w:w="50"/>
               <w:right w:type="dxa" w:w="0"/>
             </w:tcMar>
+            <w:vAlign w:val="center"/>
           </w:tcPr>
           <w:p>
             <w:r>
@@ -327,10 +333,11 @@
               <w:bottom w:type="dxa" w:w="50"/>
               <w:right w:type="dxa" w:w="120"/>
             </w:tcMar>
-          </w:tcPr>
-          <w:p>
-            <w:pPr>
-              <w:jc w:val="right"/>
+            <w:vAlign w:val="center"/>
+          </w:tcPr>
+          <w:p>
+            <w:pPr>
+              <w:jc w:val="center"/>
             </w:pPr>
             <w:r>
               <w:rPr>
@@ -358,6 +365,7 @@
               <w:bottom w:type="dxa" w:w="50"/>
               <w:right w:type="dxa" w:w="0"/>
             </w:tcMar>
+            <w:vAlign w:val="center"/>
           </w:tcPr>
           <w:p>
             <w:r>
@@ -388,10 +396,11 @@
               <w:bottom w:type="dxa" w:w="50"/>
               <w:right w:type="dxa" w:w="120"/>
             </w:tcMar>
-          </w:tcPr>
-          <w:p>
-            <w:pPr>
-              <w:jc w:val="right"/>
+            <w:vAlign w:val="center"/>
+          </w:tcPr>
+          <w:p>
+            <w:pPr>
+              <w:jc w:val="center"/>
             </w:pPr>
             <w:r>
               <w:rPr>
@@ -419,6 +428,7 @@
               <w:bottom w:type="dxa" w:w="50"/>
               <w:right w:type="dxa" w:w="0"/>
             </w:tcMar>
+            <w:vAlign w:val="center"/>
           </w:tcPr>
           <w:p>
             <w:r>
@@ -449,10 +459,11 @@
               <w:bottom w:type="dxa" w:w="50"/>
               <w:right w:type="dxa" w:w="120"/>
             </w:tcMar>
-          </w:tcPr>
-          <w:p>
-            <w:pPr>
-              <w:jc w:val="right"/>
+            <w:vAlign w:val="center"/>
+          </w:tcPr>
+          <w:p>
+            <w:pPr>
+              <w:jc w:val="center"/>
             </w:pPr>
             <w:r>
               <w:rPr>
@@ -480,6 +491,7 @@
               <w:bottom w:type="dxa" w:w="50"/>
               <w:right w:type="dxa" w:w="0"/>
             </w:tcMar>
+            <w:vAlign w:val="center"/>
           </w:tcPr>
           <w:p>
             <w:r>
@@ -510,10 +522,11 @@
               <w:bottom w:type="dxa" w:w="50"/>
               <w:right w:type="dxa" w:w="120"/>
             </w:tcMar>
-          </w:tcPr>
-          <w:p>
-            <w:pPr>
-              <w:jc w:val="right"/>
+            <w:vAlign w:val="center"/>
+          </w:tcPr>
+          <w:p>
+            <w:pPr>
+              <w:jc w:val="center"/>
             </w:pPr>
             <w:r>
               <w:rPr>
@@ -541,6 +554,7 @@
               <w:bottom w:type="dxa" w:w="50"/>
               <w:right w:type="dxa" w:w="0"/>
             </w:tcMar>
+            <w:vAlign w:val="center"/>
           </w:tcPr>
           <w:p>
             <w:r>
@@ -1495,6 +1509,59 @@
             <w:vAlign w:val="center"/>
           </w:tcPr>
           <w:p>
+            <w:r>
+              <w:t>Mint proceeds collected (gross MON)</w:t>
+            </w:r>
+          </w:p>
+        </w:tc>
+        <w:tc>
+          <w:tcPr>
+            <w:tcW w:type="dxa" w:w="4000"/>
+            <w:tcBorders>
+              <w:top w:val="single" w:color="D9D2EC" w:sz="4"/>
+              <w:left w:val="single" w:color="D9D2EC" w:sz="4"/>
+              <w:bottom w:val="single" w:color="D9D2EC" w:sz="4"/>
+              <w:right w:val="single" w:color="D9D2EC" w:sz="4"/>
+            </w:tcBorders>
+            <w:shd w:fill="FFFFFF" w:val="clear"/>
+            <w:tcMar>
+              <w:top w:type="dxa" w:w="80"/>
+              <w:left w:type="dxa" w:w="130"/>
+              <w:bottom w:type="dxa" w:w="80"/>
+              <w:right w:type="dxa" w:w="130"/>
+            </w:tcMar>
+            <w:vAlign w:val="center"/>
+          </w:tcPr>
+          <w:p>
+            <w:pPr>
+              <w:jc w:val="center"/>
+            </w:pPr>
+            <w:r>
+              <w:t>288,045 MON</w:t>
+            </w:r>
+          </w:p>
+        </w:tc>
+      </w:tr>
+      <w:tr>
+        <w:tc>
+          <w:tcPr>
+            <w:tcW w:type="dxa" w:w="5360"/>
+            <w:tcBorders>
+              <w:top w:val="single" w:color="D9D2EC" w:sz="4"/>
+              <w:left w:val="single" w:color="D9D2EC" w:sz="4"/>
+              <w:bottom w:val="single" w:color="D9D2EC" w:sz="4"/>
+              <w:right w:val="single" w:color="D9D2EC" w:sz="4"/>
+            </w:tcBorders>
+            <w:shd w:fill="F6F3FE" w:val="clear"/>
+            <w:tcMar>
+              <w:top w:type="dxa" w:w="80"/>
+              <w:left w:type="dxa" w:w="130"/>
+              <w:bottom w:type="dxa" w:w="80"/>
+              <w:right w:type="dxa" w:w="130"/>
+            </w:tcMar>
+            <w:vAlign w:val="center"/>
+          </w:tcPr>
+          <w:p>
             <w:pPr>
               <w:jc w:val="left"/>
             </w:pPr>
@@ -1507,7 +1574,7 @@
                 <w:sz w:val="17"/>
                 <w:szCs w:val="17"/>
               </w:rPr>
-              <w:t xml:space="preserve">Mint proceeds collected (gross, native MON)</w:t>
+              <w:t xml:space="preserve">Royalties actually received (matched)</w:t>
             </w:r>
           </w:p>
         </w:tc>
@@ -1520,18 +1587,18 @@
               <w:bottom w:val="single" w:color="D9D2EC" w:sz="4"/>
               <w:right w:val="single" w:color="D9D2EC" w:sz="4"/>
             </w:tcBorders>
-            <w:shd w:fill="FFFFFF" w:val="clear"/>
-            <w:tcMar>
-              <w:top w:type="dxa" w:w="80"/>
-              <w:left w:type="dxa" w:w="130"/>
-              <w:bottom w:type="dxa" w:w="80"/>
-              <w:right w:type="dxa" w:w="130"/>
-            </w:tcMar>
-            <w:vAlign w:val="center"/>
-          </w:tcPr>
-          <w:p>
-            <w:pPr>
-              <w:jc w:val="right"/>
+            <w:shd w:fill="F6F3FE" w:val="clear"/>
+            <w:tcMar>
+              <w:top w:type="dxa" w:w="80"/>
+              <w:left w:type="dxa" w:w="130"/>
+              <w:bottom w:type="dxa" w:w="80"/>
+              <w:right w:type="dxa" w:w="130"/>
+            </w:tcMar>
+            <w:vAlign w:val="center"/>
+          </w:tcPr>
+          <w:p>
+            <w:pPr>
+              <w:jc w:val="center"/>
             </w:pPr>
             <w:r>
               <w:rPr>
@@ -1540,7 +1607,7 @@
                 <w:sz w:val="17"/>
                 <w:szCs w:val="17"/>
               </w:rPr>
-              <w:t xml:space="preserve">236,097 MON</w:t>
+              <w:t xml:space="preserve">78,483.61 MON</w:t>
             </w:r>
           </w:p>
         </w:tc>
@@ -1555,7 +1622,7 @@
               <w:bottom w:val="single" w:color="D9D2EC" w:sz="4"/>
               <w:right w:val="single" w:color="D9D2EC" w:sz="4"/>
             </w:tcBorders>
-            <w:shd w:fill="F6F3FE" w:val="clear"/>
+            <w:shd w:fill="FFFFFF" w:val="clear"/>
             <w:tcMar>
               <w:top w:type="dxa" w:w="80"/>
               <w:left w:type="dxa" w:w="130"/>
@@ -1577,7 +1644,7 @@
                 <w:sz w:val="17"/>
                 <w:szCs w:val="17"/>
               </w:rPr>
-              <w:t xml:space="preserve">Royalties actually received (matched)</w:t>
+              <w:t xml:space="preserve">Validator total stake (forthenads, snapshot view)</w:t>
             </w:r>
           </w:p>
         </w:tc>
@@ -1590,27 +1657,27 @@
               <w:bottom w:val="single" w:color="D9D2EC" w:sz="4"/>
               <w:right w:val="single" w:color="D9D2EC" w:sz="4"/>
             </w:tcBorders>
-            <w:shd w:fill="F6F3FE" w:val="clear"/>
-            <w:tcMar>
-              <w:top w:type="dxa" w:w="80"/>
-              <w:left w:type="dxa" w:w="130"/>
-              <w:bottom w:type="dxa" w:w="80"/>
-              <w:right w:type="dxa" w:w="130"/>
-            </w:tcMar>
-            <w:vAlign w:val="center"/>
-          </w:tcPr>
-          <w:p>
-            <w:pPr>
-              <w:jc w:val="right"/>
-            </w:pPr>
-            <w:r>
-              <w:rPr>
-                <w:rFonts w:ascii="IBM Plex Mono" w:cs="IBM Plex Mono" w:eastAsia="IBM Plex Mono" w:hAnsi="IBM Plex Mono"/>
-                <w:color w:val="4A3494"/>
+            <w:shd w:fill="FFFFFF" w:val="clear"/>
+            <w:tcMar>
+              <w:top w:type="dxa" w:w="80"/>
+              <w:left w:type="dxa" w:w="130"/>
+              <w:bottom w:type="dxa" w:w="80"/>
+              <w:right w:type="dxa" w:w="130"/>
+            </w:tcMar>
+            <w:vAlign w:val="center"/>
+          </w:tcPr>
+          <w:p>
+            <w:pPr>
+              <w:jc w:val="center"/>
+            </w:pPr>
+            <w:r>
+              <w:rPr>
+                <w:rFonts w:ascii="IBM Plex Mono" w:cs="IBM Plex Mono" w:eastAsia="IBM Plex Mono" w:hAnsi="IBM Plex Mono"/>
+                <w:color w:val="1A1523"/>
                 <w:sz w:val="17"/>
                 <w:szCs w:val="17"/>
               </w:rPr>
-              <w:t xml:space="preserve">78,483.61 MON</w:t>
+              <w:t xml:space="preserve">~99,762,221 MON</w:t>
             </w:r>
           </w:p>
         </w:tc>
@@ -1625,7 +1692,7 @@
               <w:bottom w:val="single" w:color="D9D2EC" w:sz="4"/>
               <w:right w:val="single" w:color="D9D2EC" w:sz="4"/>
             </w:tcBorders>
-            <w:shd w:fill="FFFFFF" w:val="clear"/>
+            <w:shd w:fill="F6F3FE" w:val="clear"/>
             <w:tcMar>
               <w:top w:type="dxa" w:w="80"/>
               <w:left w:type="dxa" w:w="130"/>
@@ -1647,7 +1714,7 @@
                 <w:sz w:val="17"/>
                 <w:szCs w:val="17"/>
               </w:rPr>
-              <w:t xml:space="preserve">Validator total stake (forthenads, snapshot view)</w:t>
+              <w:t xml:space="preserve">Deployer-specific validator stake</w:t>
             </w:r>
           </w:p>
         </w:tc>
@@ -1660,41 +1727,6 @@
               <w:bottom w:val="single" w:color="D9D2EC" w:sz="4"/>
               <w:right w:val="single" w:color="D9D2EC" w:sz="4"/>
             </w:tcBorders>
-            <w:shd w:fill="FFFFFF" w:val="clear"/>
-            <w:tcMar>
-              <w:top w:type="dxa" w:w="80"/>
-              <w:left w:type="dxa" w:w="130"/>
-              <w:bottom w:type="dxa" w:w="80"/>
-              <w:right w:type="dxa" w:w="130"/>
-            </w:tcMar>
-            <w:vAlign w:val="center"/>
-          </w:tcPr>
-          <w:p>
-            <w:pPr>
-              <w:jc w:val="right"/>
-            </w:pPr>
-            <w:r>
-              <w:rPr>
-                <w:rFonts w:ascii="IBM Plex Mono" w:cs="IBM Plex Mono" w:eastAsia="IBM Plex Mono" w:hAnsi="IBM Plex Mono"/>
-                <w:color w:val="1A1523"/>
-                <w:sz w:val="17"/>
-                <w:szCs w:val="17"/>
-              </w:rPr>
-              <w:t xml:space="preserve">~99,762,221 MON</w:t>
-            </w:r>
-          </w:p>
-        </w:tc>
-      </w:tr>
-      <w:tr>
-        <w:tc>
-          <w:tcPr>
-            <w:tcW w:type="dxa" w:w="5360"/>
-            <w:tcBorders>
-              <w:top w:val="single" w:color="D9D2EC" w:sz="4"/>
-              <w:left w:val="single" w:color="D9D2EC" w:sz="4"/>
-              <w:bottom w:val="single" w:color="D9D2EC" w:sz="4"/>
-              <w:right w:val="single" w:color="D9D2EC" w:sz="4"/>
-            </w:tcBorders>
             <w:shd w:fill="F6F3FE" w:val="clear"/>
             <w:tcMar>
               <w:top w:type="dxa" w:w="80"/>
@@ -1706,42 +1738,7 @@
           </w:tcPr>
           <w:p>
             <w:pPr>
-              <w:jc w:val="left"/>
-            </w:pPr>
-            <w:r>
-              <w:rPr>
-                <w:rFonts w:ascii="IBM Plex Mono" w:cs="IBM Plex Mono" w:eastAsia="IBM Plex Mono" w:hAnsi="IBM Plex Mono"/>
-                <w:b/>
-                <w:bCs/>
-                <w:color w:val="1A1523"/>
-                <w:sz w:val="17"/>
-                <w:szCs w:val="17"/>
-              </w:rPr>
-              <w:t xml:space="preserve">Deployer-specific validator stake</w:t>
-            </w:r>
-          </w:p>
-        </w:tc>
-        <w:tc>
-          <w:tcPr>
-            <w:tcW w:type="dxa" w:w="4000"/>
-            <w:tcBorders>
-              <w:top w:val="single" w:color="D9D2EC" w:sz="4"/>
-              <w:left w:val="single" w:color="D9D2EC" w:sz="4"/>
-              <w:bottom w:val="single" w:color="D9D2EC" w:sz="4"/>
-              <w:right w:val="single" w:color="D9D2EC" w:sz="4"/>
-            </w:tcBorders>
-            <w:shd w:fill="F6F3FE" w:val="clear"/>
-            <w:tcMar>
-              <w:top w:type="dxa" w:w="80"/>
-              <w:left w:type="dxa" w:w="130"/>
-              <w:bottom w:type="dxa" w:w="80"/>
-              <w:right w:type="dxa" w:w="130"/>
-            </w:tcMar>
-            <w:vAlign w:val="center"/>
-          </w:tcPr>
-          <w:p>
-            <w:pPr>
-              <w:jc w:val="right"/>
+              <w:jc w:val="center"/>
             </w:pPr>
             <w:r>
               <w:rPr>
@@ -1909,7 +1906,7 @@
           <w:sz w:val="18"/>
           <w:szCs w:val="18"/>
         </w:rPr>
-        <w:t xml:space="preserve">In one line: </w:t>
+        <w:t>In one line: the collection collected 288,045 MON of gross mint proceeds, the royalty/deployer wallet actually received about 78.5K MON in matched royalties, and the deployer has committed about 282K MON of personal stake into the Monad ecosystem via the forthenads validator. These are three different things and the report keeps them separate.</w:t>
       </w:r>
       <w:r>
         <w:rPr>
@@ -1918,7 +1915,6 @@
           <w:sz w:val="18"/>
           <w:szCs w:val="18"/>
         </w:rPr>
-        <w:t xml:space="preserve">the collection brought in roughly 236K MON of gross mint value, the royalty/deployer wallet actually received about 78.5K MON in matched royalties, and the deployer has committed about 282K MON of personal stake into the Monad ecosystem via the forthenads validator. These are three different things and the report keeps them separate.</w:t>
       </w:r>
     </w:p>
     <w:p>
@@ -2015,7 +2011,7 @@
           <w:sz w:val="19"/>
           <w:szCs w:val="19"/>
         </w:rPr>
-        <w:t xml:space="preserve">Mint proceeds</w:t>
+        <w:t>Mint proceeds — 865 non-free NFTs minted at 333 MON each. This is gross value, not profit.</w:t>
       </w:r>
       <w:r>
         <w:rPr>
@@ -2024,7 +2020,6 @@
           <w:sz w:val="19"/>
           <w:szCs w:val="19"/>
         </w:rPr>
-        <w:t xml:space="preserve"> — the native MON value attached to mint transactions. This is gross value, not profit.</w:t>
       </w:r>
     </w:p>
     <w:p>
@@ -3493,6 +3488,7 @@
               <w:bottom w:type="dxa" w:w="60"/>
               <w:right w:type="dxa" w:w="0"/>
             </w:tcMar>
+            <w:vAlign w:val="center"/>
           </w:tcPr>
           <w:p>
             <w:r>
@@ -3520,6 +3516,7 @@
           <w:p>
             <w:pPr>
               <w:spacing w:after="30"/>
+              <w:jc w:val="center"/>
             </w:pPr>
             <w:r>
               <w:rPr>
@@ -3615,7 +3612,7 @@
           <w:sz w:val="19"/>
           <w:szCs w:val="19"/>
         </w:rPr>
-        <w:t xml:space="preserve">This section measures the native MON value attached to transactions that minted r3tards NFTs (transfers from the zero address). All figures come from the mint-proceeds audit summary.</w:t>
+        <w:t>This section summarizes the project-level mint proceeds calculation for r3tards NFTs. The public mint proceeds figure is based on 865 non-free NFTs minted at 333 MON each. All figures come from the mint-proceeds audit summary.</w:t>
       </w:r>
     </w:p>
     <w:p>
@@ -3650,6 +3647,7 @@
               <w:bottom w:type="dxa" w:w="60"/>
               <w:right w:type="dxa" w:w="0"/>
             </w:tcMar>
+            <w:vAlign w:val="center"/>
           </w:tcPr>
           <w:p>
             <w:r>
@@ -3675,58 +3673,12 @@
             <w:vAlign w:val="center"/>
           </w:tcPr>
           <w:p>
-            <w:pPr>
-              <w:spacing w:after="30"/>
-            </w:pPr>
-            <w:r>
-              <w:rPr>
-                <w:rFonts w:ascii="IBM Plex Mono" w:cs="IBM Plex Mono" w:eastAsia="IBM Plex Mono" w:hAnsi="IBM Plex Mono"/>
-                <w:b/>
-                <w:bCs/>
-                <w:color w:val="6B6478"/>
-                <w:spacing w:val="20"/>
-                <w:sz w:val="15"/>
-                <w:szCs w:val="15"/>
-              </w:rPr>
-              <w:t xml:space="preserve">GROSS MINT TRANSACTION VALUE</w:t>
-            </w:r>
-          </w:p>
-          <w:p>
-            <w:pPr>
-              <w:spacing w:after="40"/>
-            </w:pPr>
-            <w:r>
-              <w:rPr>
-                <w:rFonts w:ascii="Schoolbell" w:cs="Schoolbell" w:eastAsia="Schoolbell" w:hAnsi="Schoolbell"/>
-                <w:color w:val="4A3494"/>
-                <w:sz w:val="44"/>
-                <w:szCs w:val="44"/>
-              </w:rPr>
-              <w:t xml:space="preserve">236,097</w:t>
-            </w:r>
-            <w:r>
-              <w:rPr>
-                <w:rFonts w:ascii="IBM Plex Mono" w:cs="IBM Plex Mono" w:eastAsia="IBM Plex Mono" w:hAnsi="IBM Plex Mono"/>
-                <w:b/>
-                <w:bCs/>
-                <w:color w:val="4A3494"/>
-                <w:sz w:val="20"/>
-                <w:szCs w:val="20"/>
-              </w:rPr>
-              <w:t xml:space="preserve">  MON</w:t>
-            </w:r>
-          </w:p>
-          <w:p>
-            <w:r>
-              <w:rPr>
-                <w:rFonts w:ascii="IBM Plex Mono" w:cs="IBM Plex Mono" w:eastAsia="IBM Plex Mono" w:hAnsi="IBM Plex Mono"/>
-                <w:i/>
-                <w:iCs/>
-                <w:color w:val="6B6478"/>
-                <w:sz w:val="16"/>
-                <w:szCs w:val="16"/>
-              </w:rPr>
-              <w:t xml:space="preserve">Total native MON attached to all 673 mint transactions. This is gross value, not profit.</w:t>
+            <w:r>
+              <w:t>MINT PROCEEDS COLLECTED</w:t>
+              <w:br/>
+              <w:t>288,045  MON</w:t>
+              <w:br/>
+              <w:t>865 non-free NFTs minted at 333 MON each. This is gross value, not profit.</w:t>
             </w:r>
           </w:p>
         </w:tc>
@@ -3774,58 +3726,12 @@
             <w:vAlign w:val="center"/>
           </w:tcPr>
           <w:p>
-            <w:pPr>
-              <w:spacing w:after="24"/>
-            </w:pPr>
-            <w:r>
-              <w:rPr>
-                <w:rFonts w:ascii="IBM Plex Mono" w:cs="IBM Plex Mono" w:eastAsia="IBM Plex Mono" w:hAnsi="IBM Plex Mono"/>
-                <w:b/>
-                <w:bCs/>
-                <w:color w:val="6B6478"/>
-                <w:spacing w:val="16"/>
-                <w:sz w:val="14"/>
-                <w:szCs w:val="14"/>
-              </w:rPr>
-              <w:t xml:space="preserve">DIRECT TO NFT CONTRACT</w:t>
-            </w:r>
-          </w:p>
-          <w:p>
-            <w:pPr>
-              <w:spacing w:after="30"/>
-            </w:pPr>
-            <w:r>
-              <w:rPr>
-                <w:rFonts w:ascii="Schoolbell" w:cs="Schoolbell" w:eastAsia="Schoolbell" w:hAnsi="Schoolbell"/>
-                <w:color w:val="4A3494"/>
-                <w:sz w:val="30"/>
-                <w:szCs w:val="30"/>
-              </w:rPr>
-              <w:t xml:space="preserve">234,765</w:t>
-            </w:r>
-            <w:r>
-              <w:rPr>
-                <w:rFonts w:ascii="IBM Plex Mono" w:cs="IBM Plex Mono" w:eastAsia="IBM Plex Mono" w:hAnsi="IBM Plex Mono"/>
-                <w:b/>
-                <w:bCs/>
-                <w:color w:val="4A3494"/>
-                <w:sz w:val="15"/>
-                <w:szCs w:val="15"/>
-              </w:rPr>
-              <w:t xml:space="preserve">  MON</w:t>
-            </w:r>
-          </w:p>
-          <w:p>
-            <w:r>
-              <w:rPr>
-                <w:rFonts w:ascii="IBM Plex Mono" w:cs="IBM Plex Mono" w:eastAsia="IBM Plex Mono" w:hAnsi="IBM Plex Mono"/>
-                <w:i/>
-                <w:iCs/>
-                <w:color w:val="6B6478"/>
-                <w:sz w:val="14"/>
-                <w:szCs w:val="14"/>
-              </w:rPr>
-              <w:t xml:space="preserve">Strictest direct-mint figure</w:t>
+            <w:r>
+              <w:t>NON-FREE MINTED NFTS</w:t>
+              <w:br/>
+              <w:t>865</w:t>
+              <w:br/>
+              <w:t>Minted at 333 MON each</w:t>
             </w:r>
           </w:p>
         </w:tc>
@@ -3838,6 +3744,7 @@
               <w:bottom w:val="none"/>
               <w:right w:val="none"/>
             </w:tcBorders>
+            <w:vAlign w:val="center"/>
           </w:tcPr>
           <w:p>
             <w:r>
@@ -3869,58 +3776,12 @@
             <w:vAlign w:val="center"/>
           </w:tcPr>
           <w:p>
-            <w:pPr>
-              <w:spacing w:after="24"/>
-            </w:pPr>
-            <w:r>
-              <w:rPr>
-                <w:rFonts w:ascii="IBM Plex Mono" w:cs="IBM Plex Mono" w:eastAsia="IBM Plex Mono" w:hAnsi="IBM Plex Mono"/>
-                <w:b/>
-                <w:bCs/>
-                <w:color w:val="6B6478"/>
-                <w:spacing w:val="16"/>
-                <w:sz w:val="14"/>
-                <w:szCs w:val="14"/>
-              </w:rPr>
-              <w:t xml:space="preserve">VIA OTHER CONTRACTS</w:t>
-            </w:r>
-          </w:p>
-          <w:p>
-            <w:pPr>
-              <w:spacing w:after="30"/>
-            </w:pPr>
-            <w:r>
-              <w:rPr>
-                <w:rFonts w:ascii="Schoolbell" w:cs="Schoolbell" w:eastAsia="Schoolbell" w:hAnsi="Schoolbell"/>
-                <w:color w:val="4A3494"/>
-                <w:sz w:val="30"/>
-                <w:szCs w:val="30"/>
-              </w:rPr>
-              <w:t xml:space="preserve">1,332</w:t>
-            </w:r>
-            <w:r>
-              <w:rPr>
-                <w:rFonts w:ascii="IBM Plex Mono" w:cs="IBM Plex Mono" w:eastAsia="IBM Plex Mono" w:hAnsi="IBM Plex Mono"/>
-                <w:b/>
-                <w:bCs/>
-                <w:color w:val="4A3494"/>
-                <w:sz w:val="15"/>
-                <w:szCs w:val="15"/>
-              </w:rPr>
-              <w:t xml:space="preserve">  MON</w:t>
-            </w:r>
-          </w:p>
-          <w:p>
-            <w:r>
-              <w:rPr>
-                <w:rFonts w:ascii="IBM Plex Mono" w:cs="IBM Plex Mono" w:eastAsia="IBM Plex Mono" w:hAnsi="IBM Plex Mono"/>
-                <w:i/>
-                <w:iCs/>
-                <w:color w:val="6B6478"/>
-                <w:sz w:val="14"/>
-                <w:szCs w:val="14"/>
-              </w:rPr>
-              <w:t xml:space="preserve">Routed through a router/contract</w:t>
+            <w:r>
+              <w:t>FREE-MINTED NFTS</w:t>
+              <w:br/>
+              <w:t>168</w:t>
+              <w:br/>
+              <w:t>Project-level free mint count</w:t>
             </w:r>
           </w:p>
         </w:tc>
@@ -3983,19 +3844,8 @@
             <w:vAlign w:val="center"/>
           </w:tcPr>
           <w:p>
-            <w:pPr>
-              <w:jc w:val="left"/>
-            </w:pPr>
-            <w:r>
-              <w:rPr>
-                <w:rFonts w:ascii="IBM Plex Mono" w:cs="IBM Plex Mono" w:eastAsia="IBM Plex Mono" w:hAnsi="IBM Plex Mono"/>
-                <w:b/>
-                <w:bCs/>
-                <w:color w:val="FFFFFF"/>
-                <w:sz w:val="16"/>
-                <w:szCs w:val="16"/>
-              </w:rPr>
-              <w:t xml:space="preserve">Metric</w:t>
+            <w:r>
+              <w:t>Metric</w:t>
             </w:r>
           </w:p>
         </w:tc>
@@ -4018,19 +3868,8 @@
             <w:vAlign w:val="center"/>
           </w:tcPr>
           <w:p>
-            <w:pPr>
-              <w:jc w:val="right"/>
-            </w:pPr>
-            <w:r>
-              <w:rPr>
-                <w:rFonts w:ascii="IBM Plex Mono" w:cs="IBM Plex Mono" w:eastAsia="IBM Plex Mono" w:hAnsi="IBM Plex Mono"/>
-                <w:b/>
-                <w:bCs/>
-                <w:color w:val="FFFFFF"/>
-                <w:sz w:val="16"/>
-                <w:szCs w:val="16"/>
-              </w:rPr>
-              <w:t xml:space="preserve">Value</w:t>
+            <w:r>
+              <w:t>Value</w:t>
             </w:r>
           </w:p>
         </w:tc>
@@ -4053,19 +3892,8 @@
             <w:vAlign w:val="center"/>
           </w:tcPr>
           <w:p>
-            <w:pPr>
-              <w:jc w:val="left"/>
-            </w:pPr>
-            <w:r>
-              <w:rPr>
-                <w:rFonts w:ascii="IBM Plex Mono" w:cs="IBM Plex Mono" w:eastAsia="IBM Plex Mono" w:hAnsi="IBM Plex Mono"/>
-                <w:b/>
-                <w:bCs/>
-                <w:color w:val="FFFFFF"/>
-                <w:sz w:val="16"/>
-                <w:szCs w:val="16"/>
-              </w:rPr>
-              <w:t xml:space="preserve">What it means</w:t>
+            <w:r>
+              <w:t>What it means</w:t>
             </w:r>
           </w:p>
         </w:tc>
@@ -4090,19 +3918,8 @@
             <w:vAlign w:val="center"/>
           </w:tcPr>
           <w:p>
-            <w:pPr>
-              <w:jc w:val="left"/>
-            </w:pPr>
-            <w:r>
-              <w:rPr>
-                <w:rFonts w:ascii="IBM Plex Mono" w:cs="IBM Plex Mono" w:eastAsia="IBM Plex Mono" w:hAnsi="IBM Plex Mono"/>
-                <w:b/>
-                <w:bCs/>
-                <w:color w:val="1A1523"/>
-                <w:sz w:val="17"/>
-                <w:szCs w:val="17"/>
-              </w:rPr>
-              <w:t xml:space="preserve">Mint events from zero</w:t>
+            <w:r>
+              <w:t>Mint events from zero</w:t>
             </w:r>
           </w:p>
         </w:tc>
@@ -4125,17 +3942,8 @@
             <w:vAlign w:val="center"/>
           </w:tcPr>
           <w:p>
-            <w:pPr>
-              <w:jc w:val="right"/>
-            </w:pPr>
-            <w:r>
-              <w:rPr>
-                <w:rFonts w:ascii="IBM Plex Mono" w:cs="IBM Plex Mono" w:eastAsia="IBM Plex Mono" w:hAnsi="IBM Plex Mono"/>
-                <w:color w:val="1A1523"/>
-                <w:sz w:val="17"/>
-                <w:szCs w:val="17"/>
-              </w:rPr>
-              <w:t xml:space="preserve">1,033</w:t>
+            <w:r>
+              <w:t>1,033</w:t>
             </w:r>
           </w:p>
         </w:tc>
@@ -4158,17 +3966,8 @@
             <w:vAlign w:val="center"/>
           </w:tcPr>
           <w:p>
-            <w:pPr>
-              <w:jc w:val="left"/>
-            </w:pPr>
-            <w:r>
-              <w:rPr>
-                <w:rFonts w:ascii="IBM Plex Mono" w:cs="IBM Plex Mono" w:eastAsia="IBM Plex Mono" w:hAnsi="IBM Plex Mono"/>
-                <w:color w:val="1A1523"/>
-                <w:sz w:val="15"/>
-                <w:szCs w:val="15"/>
-              </w:rPr>
-              <w:t xml:space="preserve">NFTs minted (transfers from the zero address).</w:t>
+            <w:r>
+              <w:t>NFTs minted (transfers from the zero address).</w:t>
             </w:r>
           </w:p>
         </w:tc>
@@ -4193,19 +3992,8 @@
             <w:vAlign w:val="center"/>
           </w:tcPr>
           <w:p>
-            <w:pPr>
-              <w:jc w:val="left"/>
-            </w:pPr>
-            <w:r>
-              <w:rPr>
-                <w:rFonts w:ascii="IBM Plex Mono" w:cs="IBM Plex Mono" w:eastAsia="IBM Plex Mono" w:hAnsi="IBM Plex Mono"/>
-                <w:b/>
-                <w:bCs/>
-                <w:color w:val="1A1523"/>
-                <w:sz w:val="17"/>
-                <w:szCs w:val="17"/>
-              </w:rPr>
-              <w:t xml:space="preserve">Unique mint transactions</w:t>
+            <w:r>
+              <w:t>Unique mint transactions</w:t>
             </w:r>
           </w:p>
         </w:tc>
@@ -4228,17 +4016,8 @@
             <w:vAlign w:val="center"/>
           </w:tcPr>
           <w:p>
-            <w:pPr>
-              <w:jc w:val="right"/>
-            </w:pPr>
-            <w:r>
-              <w:rPr>
-                <w:rFonts w:ascii="IBM Plex Mono" w:cs="IBM Plex Mono" w:eastAsia="IBM Plex Mono" w:hAnsi="IBM Plex Mono"/>
-                <w:color w:val="1A1523"/>
-                <w:sz w:val="17"/>
-                <w:szCs w:val="17"/>
-              </w:rPr>
-              <w:t xml:space="preserve">673</w:t>
+            <w:r>
+              <w:t>673</w:t>
             </w:r>
           </w:p>
         </w:tc>
@@ -4261,17 +4040,8 @@
             <w:vAlign w:val="center"/>
           </w:tcPr>
           <w:p>
-            <w:pPr>
-              <w:jc w:val="left"/>
-            </w:pPr>
-            <w:r>
-              <w:rPr>
-                <w:rFonts w:ascii="IBM Plex Mono" w:cs="IBM Plex Mono" w:eastAsia="IBM Plex Mono" w:hAnsi="IBM Plex Mono"/>
-                <w:color w:val="1A1523"/>
-                <w:sz w:val="15"/>
-                <w:szCs w:val="15"/>
-              </w:rPr>
-              <w:t xml:space="preserve">Distinct transactions that minted at least one NFT.</w:t>
+            <w:r>
+              <w:t>Distinct transactions that minted at least one NFT.</w:t>
             </w:r>
           </w:p>
         </w:tc>
@@ -4296,19 +4066,8 @@
             <w:vAlign w:val="center"/>
           </w:tcPr>
           <w:p>
-            <w:pPr>
-              <w:jc w:val="left"/>
-            </w:pPr>
-            <w:r>
-              <w:rPr>
-                <w:rFonts w:ascii="IBM Plex Mono" w:cs="IBM Plex Mono" w:eastAsia="IBM Plex Mono" w:hAnsi="IBM Plex Mono"/>
-                <w:b/>
-                <w:bCs/>
-                <w:color w:val="1A1523"/>
-                <w:sz w:val="17"/>
-                <w:szCs w:val="17"/>
-              </w:rPr>
-              <w:t xml:space="preserve">Gross mint value</w:t>
+            <w:r>
+              <w:t>Mint proceeds collected</w:t>
             </w:r>
           </w:p>
         </w:tc>
@@ -4332,16 +4091,10 @@
           </w:tcPr>
           <w:p>
             <w:pPr>
-              <w:jc w:val="right"/>
-            </w:pPr>
-            <w:r>
-              <w:rPr>
-                <w:rFonts w:ascii="IBM Plex Mono" w:cs="IBM Plex Mono" w:eastAsia="IBM Plex Mono" w:hAnsi="IBM Plex Mono"/>
-                <w:color w:val="4A3494"/>
-                <w:sz w:val="17"/>
-                <w:szCs w:val="17"/>
-              </w:rPr>
-              <w:t xml:space="preserve">236,097 MON</w:t>
+              <w:jc w:val="center"/>
+            </w:pPr>
+            <w:r>
+              <w:t>288,045 MON</w:t>
             </w:r>
           </w:p>
         </w:tc>
@@ -4364,17 +4117,8 @@
             <w:vAlign w:val="center"/>
           </w:tcPr>
           <w:p>
-            <w:pPr>
-              <w:jc w:val="left"/>
-            </w:pPr>
-            <w:r>
-              <w:rPr>
-                <w:rFonts w:ascii="IBM Plex Mono" w:cs="IBM Plex Mono" w:eastAsia="IBM Plex Mono" w:hAnsi="IBM Plex Mono"/>
-                <w:color w:val="1A1523"/>
-                <w:sz w:val="15"/>
-                <w:szCs w:val="15"/>
-              </w:rPr>
-              <w:t xml:space="preserve">All native MON attached to those transactions.</w:t>
+            <w:r>
+              <w:t>865 non-free NFTs × 333 MON.</w:t>
             </w:r>
           </w:p>
         </w:tc>
@@ -4399,19 +4143,8 @@
             <w:vAlign w:val="center"/>
           </w:tcPr>
           <w:p>
-            <w:pPr>
-              <w:jc w:val="left"/>
-            </w:pPr>
-            <w:r>
-              <w:rPr>
-                <w:rFonts w:ascii="IBM Plex Mono" w:cs="IBM Plex Mono" w:eastAsia="IBM Plex Mono" w:hAnsi="IBM Plex Mono"/>
-                <w:b/>
-                <w:bCs/>
-                <w:color w:val="1A1523"/>
-                <w:sz w:val="17"/>
-                <w:szCs w:val="17"/>
-              </w:rPr>
-              <w:t xml:space="preserve">Direct-to-contract</w:t>
+            <w:r>
+              <w:t>Mint price</w:t>
             </w:r>
           </w:p>
         </w:tc>
@@ -4435,16 +4168,10 @@
           </w:tcPr>
           <w:p>
             <w:pPr>
-              <w:jc w:val="right"/>
-            </w:pPr>
-            <w:r>
-              <w:rPr>
-                <w:rFonts w:ascii="IBM Plex Mono" w:cs="IBM Plex Mono" w:eastAsia="IBM Plex Mono" w:hAnsi="IBM Plex Mono"/>
-                <w:color w:val="1A1523"/>
-                <w:sz w:val="17"/>
-                <w:szCs w:val="17"/>
-              </w:rPr>
-              <w:t xml:space="preserve">234,765 MON</w:t>
+              <w:jc w:val="center"/>
+            </w:pPr>
+            <w:r>
+              <w:t>333 MON</w:t>
             </w:r>
           </w:p>
         </w:tc>
@@ -4467,17 +4194,8 @@
             <w:vAlign w:val="center"/>
           </w:tcPr>
           <w:p>
-            <w:pPr>
-              <w:jc w:val="left"/>
-            </w:pPr>
-            <w:r>
-              <w:rPr>
-                <w:rFonts w:ascii="IBM Plex Mono" w:cs="IBM Plex Mono" w:eastAsia="IBM Plex Mono" w:hAnsi="IBM Plex Mono"/>
-                <w:color w:val="1A1523"/>
-                <w:sz w:val="15"/>
-                <w:szCs w:val="15"/>
-              </w:rPr>
-              <w:t xml:space="preserve">Value where the tx went straight to the NFT contract.</w:t>
+            <w:r>
+              <w:t>Price per non-free minted NFT.</w:t>
             </w:r>
           </w:p>
         </w:tc>
@@ -4503,7 +4221,7 @@
           </w:tcPr>
           <w:p>
             <w:r>
-              <w:t>Non-free minted tokens</w:t>
+              <w:t>Non-free minted NFTs</w:t>
             </w:r>
           </w:p>
         </w:tc>
@@ -4551,7 +4269,7 @@
           </w:tcPr>
           <w:p>
             <w:r>
-              <w:t>Total minted minus the project-level free mint count.</w:t>
+              <w:t>Project-level count of NFTs minted at the mint price.</w:t>
             </w:r>
           </w:p>
         </w:tc>
@@ -4651,7 +4369,7 @@
           </w:tcPr>
           <w:p>
             <w:r>
-              <w:t>Avg gross value / non-free token</w:t>
+              <w:t>Unique senders</w:t>
             </w:r>
           </w:p>
         </w:tc>
@@ -4675,7 +4393,7 @@
           </w:tcPr>
           <w:p>
             <w:r>
-              <w:t>~273 MON</w:t>
+              <w:t>542</w:t>
             </w:r>
           </w:p>
         </w:tc>
@@ -4699,7 +4417,7 @@
           </w:tcPr>
           <w:p>
             <w:r>
-              <w:t>Gross mint value divided by 865 non-free minted tokens.</w:t>
+              <w:t>Distinct wallets that sent mint transactions.</w:t>
             </w:r>
           </w:p>
         </w:tc>
@@ -4724,19 +4442,8 @@
             <w:vAlign w:val="center"/>
           </w:tcPr>
           <w:p>
-            <w:pPr>
-              <w:jc w:val="left"/>
-            </w:pPr>
-            <w:r>
-              <w:rPr>
-                <w:rFonts w:ascii="IBM Plex Mono" w:cs="IBM Plex Mono" w:eastAsia="IBM Plex Mono" w:hAnsi="IBM Plex Mono"/>
-                <w:b/>
-                <w:bCs/>
-                <w:color w:val="1A1523"/>
-                <w:sz w:val="17"/>
-                <w:szCs w:val="17"/>
-              </w:rPr>
-              <w:t xml:space="preserve">Unique senders</w:t>
+            <w:r>
+              <w:t>Unique recipients</w:t>
             </w:r>
           </w:p>
         </w:tc>
@@ -4759,17 +4466,8 @@
             <w:vAlign w:val="center"/>
           </w:tcPr>
           <w:p>
-            <w:pPr>
-              <w:jc w:val="right"/>
-            </w:pPr>
-            <w:r>
-              <w:rPr>
-                <w:rFonts w:ascii="IBM Plex Mono" w:cs="IBM Plex Mono" w:eastAsia="IBM Plex Mono" w:hAnsi="IBM Plex Mono"/>
-                <w:color w:val="1A1523"/>
-                <w:sz w:val="17"/>
-                <w:szCs w:val="17"/>
-              </w:rPr>
-              <w:t xml:space="preserve">542</w:t>
+            <w:r>
+              <w:t>642</w:t>
             </w:r>
           </w:p>
         </w:tc>
@@ -4792,120 +4490,8 @@
             <w:vAlign w:val="center"/>
           </w:tcPr>
           <w:p>
-            <w:pPr>
-              <w:jc w:val="left"/>
-            </w:pPr>
-            <w:r>
-              <w:rPr>
-                <w:rFonts w:ascii="IBM Plex Mono" w:cs="IBM Plex Mono" w:eastAsia="IBM Plex Mono" w:hAnsi="IBM Plex Mono"/>
-                <w:color w:val="1A1523"/>
-                <w:sz w:val="15"/>
-                <w:szCs w:val="15"/>
-              </w:rPr>
-              <w:t xml:space="preserve">Distinct wallets that sent mint transactions.</w:t>
-            </w:r>
-          </w:p>
-        </w:tc>
-      </w:tr>
-      <w:tr>
-        <w:tc>
-          <w:tcPr>
-            <w:tcW w:type="dxa" w:w="3500"/>
-            <w:tcBorders>
-              <w:top w:val="single" w:color="D9D2EC" w:sz="4"/>
-              <w:left w:val="single" w:color="D9D2EC" w:sz="4"/>
-              <w:bottom w:val="single" w:color="D9D2EC" w:sz="4"/>
-              <w:right w:val="single" w:color="D9D2EC" w:sz="4"/>
-            </w:tcBorders>
-            <w:shd w:fill="FFFFFF" w:val="clear"/>
-            <w:tcMar>
-              <w:top w:type="dxa" w:w="80"/>
-              <w:left w:type="dxa" w:w="130"/>
-              <w:bottom w:type="dxa" w:w="80"/>
-              <w:right w:type="dxa" w:w="130"/>
-            </w:tcMar>
-            <w:vAlign w:val="center"/>
-          </w:tcPr>
-          <w:p>
-            <w:pPr>
-              <w:jc w:val="left"/>
-            </w:pPr>
-            <w:r>
-              <w:rPr>
-                <w:rFonts w:ascii="IBM Plex Mono" w:cs="IBM Plex Mono" w:eastAsia="IBM Plex Mono" w:hAnsi="IBM Plex Mono"/>
-                <w:b/>
-                <w:bCs/>
-                <w:color w:val="1A1523"/>
-                <w:sz w:val="17"/>
-                <w:szCs w:val="17"/>
-              </w:rPr>
-              <w:t xml:space="preserve">Unique recipients</w:t>
-            </w:r>
-          </w:p>
-        </w:tc>
-        <w:tc>
-          <w:tcPr>
-            <w:tcW w:type="dxa" w:w="1900"/>
-            <w:tcBorders>
-              <w:top w:val="single" w:color="D9D2EC" w:sz="4"/>
-              <w:left w:val="single" w:color="D9D2EC" w:sz="4"/>
-              <w:bottom w:val="single" w:color="D9D2EC" w:sz="4"/>
-              <w:right w:val="single" w:color="D9D2EC" w:sz="4"/>
-            </w:tcBorders>
-            <w:shd w:fill="FFFFFF" w:val="clear"/>
-            <w:tcMar>
-              <w:top w:type="dxa" w:w="80"/>
-              <w:left w:type="dxa" w:w="130"/>
-              <w:bottom w:type="dxa" w:w="80"/>
-              <w:right w:type="dxa" w:w="130"/>
-            </w:tcMar>
-            <w:vAlign w:val="center"/>
-          </w:tcPr>
-          <w:p>
-            <w:pPr>
-              <w:jc w:val="right"/>
-            </w:pPr>
-            <w:r>
-              <w:rPr>
-                <w:rFonts w:ascii="IBM Plex Mono" w:cs="IBM Plex Mono" w:eastAsia="IBM Plex Mono" w:hAnsi="IBM Plex Mono"/>
-                <w:color w:val="1A1523"/>
-                <w:sz w:val="17"/>
-                <w:szCs w:val="17"/>
-              </w:rPr>
-              <w:t xml:space="preserve">642</w:t>
-            </w:r>
-          </w:p>
-        </w:tc>
-        <w:tc>
-          <w:tcPr>
-            <w:tcW w:type="dxa" w:w="3960"/>
-            <w:tcBorders>
-              <w:top w:val="single" w:color="D9D2EC" w:sz="4"/>
-              <w:left w:val="single" w:color="D9D2EC" w:sz="4"/>
-              <w:bottom w:val="single" w:color="D9D2EC" w:sz="4"/>
-              <w:right w:val="single" w:color="D9D2EC" w:sz="4"/>
-            </w:tcBorders>
-            <w:shd w:fill="FFFFFF" w:val="clear"/>
-            <w:tcMar>
-              <w:top w:type="dxa" w:w="80"/>
-              <w:left w:type="dxa" w:w="130"/>
-              <w:bottom w:type="dxa" w:w="80"/>
-              <w:right w:type="dxa" w:w="130"/>
-            </w:tcMar>
-            <w:vAlign w:val="center"/>
-          </w:tcPr>
-          <w:p>
-            <w:pPr>
-              <w:jc w:val="left"/>
-            </w:pPr>
-            <w:r>
-              <w:rPr>
-                <w:rFonts w:ascii="IBM Plex Mono" w:cs="IBM Plex Mono" w:eastAsia="IBM Plex Mono" w:hAnsi="IBM Plex Mono"/>
-                <w:color w:val="1A1523"/>
-                <w:sz w:val="15"/>
-                <w:szCs w:val="15"/>
-              </w:rPr>
-              <w:t xml:space="preserve">Distinct wallets that received minted NFTs.</w:t>
+            <w:r>
+              <w:t>Distinct wallets that received minted NFTs.</w:t>
             </w:r>
           </w:p>
         </w:tc>
@@ -5099,7 +4685,7 @@
           </w:tcPr>
           <w:p>
             <w:pPr>
-              <w:jc w:val="right"/>
+              <w:jc w:val="center"/>
             </w:pPr>
             <w:r>
               <w:rPr>
@@ -5169,7 +4755,7 @@
           </w:tcPr>
           <w:p>
             <w:pPr>
-              <w:jc w:val="right"/>
+              <w:jc w:val="center"/>
             </w:pPr>
             <w:r>
               <w:rPr>
@@ -5239,7 +4825,7 @@
           </w:tcPr>
           <w:p>
             <w:pPr>
-              <w:jc w:val="right"/>
+              <w:jc w:val="center"/>
             </w:pPr>
             <w:r>
               <w:rPr>
@@ -5309,7 +4895,7 @@
           </w:tcPr>
           <w:p>
             <w:pPr>
-              <w:jc w:val="right"/>
+              <w:jc w:val="center"/>
             </w:pPr>
             <w:r>
               <w:rPr>
@@ -5337,7 +4923,7 @@
           <w:sz w:val="17"/>
           <w:szCs w:val="17"/>
         </w:rPr>
-        <w:t>Important: mint proceeds are gross value, not profit. They do not subtract gas, refunds, free mints, infrastructure, art, marketing, or any other cost. This audit measures native MON attached to mint transactions.</w:t>
+        <w:t>Important: mint proceeds are gross value, not profit. They do not subtract gas, refunds, infrastructure, art, marketing, or any other project costs.</w:t>
       </w:r>
       <w:r>
         <w:rPr>
@@ -5430,6 +5016,7 @@
               <w:bottom w:type="dxa" w:w="60"/>
               <w:right w:type="dxa" w:w="0"/>
             </w:tcMar>
+            <w:vAlign w:val="center"/>
           </w:tcPr>
           <w:p>
             <w:r>
@@ -5457,6 +5044,7 @@
           <w:p>
             <w:pPr>
               <w:spacing w:after="30"/>
+              <w:jc w:val="center"/>
             </w:pPr>
             <w:r>
               <w:rPr>
@@ -5474,6 +5062,7 @@
           <w:p>
             <w:pPr>
               <w:spacing w:after="40"/>
+              <w:jc w:val="center"/>
             </w:pPr>
             <w:r>
               <w:rPr>
@@ -5556,6 +5145,7 @@
           <w:p>
             <w:pPr>
               <w:spacing w:after="24"/>
+              <w:jc w:val="center"/>
             </w:pPr>
             <w:r>
               <w:rPr>
@@ -5573,6 +5163,7 @@
           <w:p>
             <w:pPr>
               <w:spacing w:after="30"/>
+              <w:jc w:val="center"/>
             </w:pPr>
             <w:r>
               <w:rPr>
@@ -5618,6 +5209,7 @@
               <w:bottom w:val="none"/>
               <w:right w:val="none"/>
             </w:tcBorders>
+            <w:vAlign w:val="center"/>
           </w:tcPr>
           <w:p>
             <w:r>
@@ -5651,6 +5243,7 @@
           <w:p>
             <w:pPr>
               <w:spacing w:after="24"/>
+              <w:jc w:val="center"/>
             </w:pPr>
             <w:r>
               <w:rPr>
@@ -5668,6 +5261,7 @@
           <w:p>
             <w:pPr>
               <w:spacing w:after="30"/>
+              <w:jc w:val="center"/>
             </w:pPr>
             <w:r>
               <w:rPr>
@@ -6849,7 +6443,7 @@
           </w:tcPr>
           <w:p>
             <w:pPr>
-              <w:jc w:val="right"/>
+              <w:jc w:val="center"/>
             </w:pPr>
             <w:r>
               <w:rPr>
@@ -6919,7 +6513,7 @@
           </w:tcPr>
           <w:p>
             <w:pPr>
-              <w:jc w:val="right"/>
+              <w:jc w:val="center"/>
             </w:pPr>
             <w:r>
               <w:rPr>
@@ -6989,7 +6583,7 @@
           </w:tcPr>
           <w:p>
             <w:pPr>
-              <w:jc w:val="right"/>
+              <w:jc w:val="center"/>
             </w:pPr>
             <w:r>
               <w:rPr>
@@ -7059,7 +6653,7 @@
           </w:tcPr>
           <w:p>
             <w:pPr>
-              <w:jc w:val="right"/>
+              <w:jc w:val="center"/>
             </w:pPr>
             <w:r>
               <w:rPr>
@@ -7277,6 +6871,7 @@
               <w:bottom w:type="dxa" w:w="60"/>
               <w:right w:type="dxa" w:w="0"/>
             </w:tcMar>
+            <w:vAlign w:val="center"/>
           </w:tcPr>
           <w:p>
             <w:r>
@@ -7304,6 +6899,7 @@
           <w:p>
             <w:pPr>
               <w:spacing w:after="30"/>
+              <w:jc w:val="center"/>
             </w:pPr>
             <w:r>
               <w:rPr>
@@ -7321,6 +6917,7 @@
           <w:p>
             <w:pPr>
               <w:spacing w:after="40"/>
+              <w:jc w:val="center"/>
             </w:pPr>
             <w:r>
               <w:rPr>
@@ -7511,7 +7108,7 @@
           </w:tcPr>
           <w:p>
             <w:pPr>
-              <w:jc w:val="right"/>
+              <w:jc w:val="center"/>
             </w:pPr>
             <w:r>
               <w:rPr>
@@ -7581,7 +7178,7 @@
           </w:tcPr>
           <w:p>
             <w:pPr>
-              <w:jc w:val="right"/>
+              <w:jc w:val="center"/>
             </w:pPr>
             <w:r>
               <w:rPr>
@@ -7651,7 +7248,7 @@
           </w:tcPr>
           <w:p>
             <w:pPr>
-              <w:jc w:val="right"/>
+              <w:jc w:val="center"/>
             </w:pPr>
             <w:r>
               <w:rPr>
@@ -7721,7 +7318,7 @@
           </w:tcPr>
           <w:p>
             <w:pPr>
-              <w:jc w:val="right"/>
+              <w:jc w:val="center"/>
             </w:pPr>
             <w:r>
               <w:rPr>
@@ -7861,7 +7458,7 @@
           </w:tcPr>
           <w:p>
             <w:pPr>
-              <w:jc w:val="right"/>
+              <w:jc w:val="center"/>
             </w:pPr>
             <w:r>
               <w:rPr>
@@ -7995,6 +7592,7 @@
           <w:p>
             <w:pPr>
               <w:spacing w:after="24"/>
+              <w:jc w:val="center"/>
             </w:pPr>
             <w:r>
               <w:rPr>
@@ -8057,6 +7655,7 @@
               <w:bottom w:val="none"/>
               <w:right w:val="none"/>
             </w:tcBorders>
+            <w:vAlign w:val="center"/>
           </w:tcPr>
           <w:p>
             <w:r>
@@ -8090,6 +7689,7 @@
           <w:p>
             <w:pPr>
               <w:spacing w:after="24"/>
+              <w:jc w:val="center"/>
             </w:pPr>
             <w:r>
               <w:rPr>
@@ -9030,7 +8630,7 @@
           <w:sz w:val="17"/>
           <w:szCs w:val="17"/>
         </w:rPr>
-        <w:t xml:space="preserve">Cross-check note: </w:t>
+        <w:t>Cross-check note: the public mint proceeds figure is 288,045 MON, calculated as 865 non-free NFTs multiplied by 333 MON. The likely-royalties CSV sums to 78,483.61 MON across 241 rows, matching the royalty summary. Where a value was not collected in this run, it is reported as “Not available in the provided repository data” rather than estimated.</w:t>
       </w:r>
       <w:r>
         <w:rPr>
@@ -9041,7 +8641,6 @@
           <w:sz w:val="17"/>
           <w:szCs w:val="17"/>
         </w:rPr>
-        <w:t xml:space="preserve">the CSV detail files reconcile exactly with the summary.json headline numbers. The mint transactions CSV sums to 236,097 MON gross (234,765 direct), and the likely-royalties CSV sums to 78,483.61 MON across 241 rows — matching both summaries. Where a value was not collected in this run, it is reported as “Not available in the provided repository data” rather than estimated.</w:t>
       </w:r>
     </w:p>
     <w:p>
@@ -9165,7 +8764,7 @@
           <w:sz w:val="19"/>
           <w:szCs w:val="19"/>
         </w:rPr>
-        <w:t xml:space="preserve">Mint proceeds count native MON only. Any mint paid in WMON or another ERC-20 is not included. Gross mint value is not profit and excludes all costs.</w:t>
+        <w:t>Mint proceeds are gross value, not profit. They do not subtract gas, refunds, infrastructure, art, marketing, or any other project costs.</w:t>
       </w:r>
     </w:p>
     <w:p>
@@ -9297,6 +8896,7 @@
               <w:right w:val="none"/>
             </w:tcBorders>
             <w:shd w:fill="6E54C8" w:val="clear"/>
+            <w:vAlign w:val="center"/>
           </w:tcPr>
           <w:p>
             <w:r>
@@ -9319,6 +8919,7 @@
               <w:bottom w:type="dxa" w:w="220"/>
               <w:right w:type="dxa" w:w="260"/>
             </w:tcMar>
+            <w:vAlign w:val="center"/>
           </w:tcPr>
           <w:p>
             <w:pPr>

</xml_diff>

<commit_message>
Harden audit reproducibility and evidence
</commit_message>
<xml_diff>
--- a/r3tards-transparency.docx
+++ b/r3tards-transparency.docx
@@ -2098,19 +2098,7 @@
               <w:rPr/>
             </w:pPr>
             <w:r>
-              <w:rPr>
-                <w:rFonts w:ascii="IBM Plex Mono" w:cs="IBM Plex Mono" w:eastAsia="IBM Plex Mono" w:hAnsi="IBM Plex Mono"/>
-                <w:color w:val="1a1523"/>
-                <w:sz w:val="17"/>
-                <w:szCs w:val="17"/>
-                <w:rtl w:val="0"/>
-              </w:rPr>
-              <w:t xml:space="preserve">Locked until April 2029</w:t>
-            </w:r>
-            <w:r>
-              <w:rPr>
-                <w:rtl w:val="0"/>
-              </w:rPr>
+              <w:t>35 NFTs held by lock contract; unlock rules not proven in repo</w:t>
             </w:r>
           </w:p>
         </w:tc>
@@ -2351,28 +2339,7 @@
         <w:rPr/>
       </w:pPr>
       <w:r>
-        <w:rPr>
-          <w:rFonts w:ascii="IBM Plex Mono" w:cs="IBM Plex Mono" w:eastAsia="IBM Plex Mono" w:hAnsi="IBM Plex Mono"/>
-          <w:b w:val="1"/>
-          <w:bCs w:val="1"/>
-          <w:i w:val="0"/>
-          <w:iCs w:val="0"/>
-          <w:smallCaps w:val="0"/>
-          <w:strike w:val="0"/>
-          <w:color w:val="1a1523"/>
-          <w:sz w:val="19"/>
-          <w:szCs w:val="19"/>
-          <w:u w:val="none"/>
-          <w:shd w:fill="auto" w:val="clear"/>
-          <w:vertAlign w:val="baseline"/>
-          <w:rtl w:val="0"/>
-        </w:rPr>
-        <w:t xml:space="preserve">Mint proceeds — 865 non-free NFTs minted at 333 MON each. This is gross value, not profit.</w:t>
-      </w:r>
-      <w:r>
-        <w:rPr>
-          <w:rtl w:val="0"/>
-        </w:rPr>
+        <w:t>Mint proceeds — 705 direct paid mints plus 160 router/internal paid mints, totaling 288,045 MON gross value. This is gross value, not profit.</w:t>
       </w:r>
     </w:p>
     <w:p>
@@ -3922,19 +3889,7 @@
               <w:rPr/>
             </w:pPr>
             <w:r>
-              <w:rPr>
-                <w:rFonts w:ascii="IBM Plex Mono" w:cs="IBM Plex Mono" w:eastAsia="IBM Plex Mono" w:hAnsi="IBM Plex Mono"/>
-                <w:color w:val="1a1523"/>
-                <w:sz w:val="14"/>
-                <w:szCs w:val="14"/>
-                <w:rtl w:val="0"/>
-              </w:rPr>
-              <w:t xml:space="preserve">Locked until April 2029</w:t>
-            </w:r>
-            <w:r>
-              <w:rPr>
-                <w:rtl w:val="0"/>
-              </w:rPr>
+              <w:t>35 NFTs held by lock contract; unlock rules not proven in repo</w:t>
             </w:r>
           </w:p>
         </w:tc>
@@ -4295,41 +4250,15 @@
               <w:rPr/>
             </w:pPr>
             <w:r>
-              <w:rPr>
-                <w:rFonts w:ascii="Schoolbell" w:cs="Schoolbell" w:eastAsia="Schoolbell" w:hAnsi="Schoolbell"/>
-                <w:color w:val="4a3494"/>
-                <w:sz w:val="44"/>
-                <w:szCs w:val="44"/>
-                <w:rtl w:val="0"/>
-              </w:rPr>
-              <w:t xml:space="preserve">April 2029</w:t>
-            </w:r>
-            <w:r>
-              <w:rPr>
-                <w:rtl w:val="0"/>
-              </w:rPr>
-            </w:r>
-          </w:p>
-          <w:p>
-            <w:pPr>
-              <w:rPr/>
-            </w:pPr>
-            <w:r>
-              <w:rPr>
-                <w:rFonts w:ascii="IBM Plex Mono" w:cs="IBM Plex Mono" w:eastAsia="IBM Plex Mono" w:hAnsi="IBM Plex Mono"/>
-                <w:i w:val="1"/>
-                <w:iCs w:val="1"/>
-                <w:color w:val="6b6478"/>
-                <w:sz w:val="16"/>
-                <w:szCs w:val="16"/>
-                <w:rtl w:val="0"/>
-              </w:rPr>
-              <w:t xml:space="preserve">Team allocation held in contract 0xec823eaffa4584f482a0d9c3e634840d14066242 and locked until April 2029.</w:t>
-            </w:r>
-            <w:r>
-              <w:rPr>
-                <w:rtl w:val="0"/>
-              </w:rPr>
+              <w:t>35 NFTs held</w:t>
+            </w:r>
+          </w:p>
+          <w:p>
+            <w:pPr>
+              <w:rPr/>
+            </w:pPr>
+            <w:r>
+              <w:t>Verified current holding at snapshot. Unlock date/rules require decoded contract proof.</w:t>
             </w:r>
           </w:p>
         </w:tc>
@@ -4380,19 +4309,7 @@
         <w:rPr/>
       </w:pPr>
       <w:r>
-        <w:rPr>
-          <w:rFonts w:ascii="IBM Plex Mono" w:cs="IBM Plex Mono" w:eastAsia="IBM Plex Mono" w:hAnsi="IBM Plex Mono"/>
-          <w:color w:val="1a1523"/>
-          <w:sz w:val="19"/>
-          <w:szCs w:val="19"/>
-          <w:rtl w:val="0"/>
-        </w:rPr>
-        <w:t xml:space="preserve">This section summarizes the project-level mint proceeds calculation for r3tards NFTs. The public mint proceeds figure is based on 865 non-free NFTs minted at 333 MON each. All figures come from the mint-proceeds audit summary.</w:t>
-      </w:r>
-      <w:r>
-        <w:rPr>
-          <w:rtl w:val="0"/>
-        </w:rPr>
+        <w:t>This section summarizes the reconciled mint proceeds calculation for r3tards NFTs. The public mint proceeds figure is supported by direct tx value and internal transfer evidence in the mint-proceeds audit outputs.</w:t>
       </w:r>
     </w:p>
     <w:p>
@@ -5542,17 +5459,7 @@
         <w:rPr/>
       </w:pPr>
       <w:r>
-        <w:rPr>
-          <w:b w:val="1"/>
-          <w:bCs w:val="1"/>
-          <w:rtl w:val="0"/>
-        </w:rPr>
-        <w:t xml:space="preserve">Free mint classification: this report uses the project-level count of 168 free-minted NFTs and 865 non-free-minted NFTs.</w:t>
-      </w:r>
-      <w:r>
-        <w:rPr>
-          <w:rtl w:val="0"/>
-        </w:rPr>
+        <w:t>Mint classification: 705 direct paid mints and 160 router/internal paid mints are proven by transaction/internal transfer evidence; 168 free mints have no native payment trace in committed evidence.</w:t>
       </w:r>
     </w:p>
     <w:p>
@@ -10966,21 +10873,7 @@
         <w:rPr/>
       </w:pPr>
       <w:r>
-        <w:rPr>
-          <w:rFonts w:ascii="IBM Plex Mono" w:cs="IBM Plex Mono" w:eastAsia="IBM Plex Mono" w:hAnsi="IBM Plex Mono"/>
-          <w:b w:val="1"/>
-          <w:bCs w:val="1"/>
-          <w:color w:val="16a085"/>
-          <w:sz w:val="17"/>
-          <w:szCs w:val="17"/>
-          <w:rtl w:val="0"/>
-        </w:rPr>
-        <w:t xml:space="preserve">Cross-check note: the public mint proceeds figure is 288,045 MON, calculated as 865 non-free NFTs multiplied by 333 MON. The likely-royalties CSV sums to 78,483.61 MON across 241 rows, matching the royalty summary. Where a value was not collected in this run, it is reported as “Not available in the provided repository data” rather than estimated.</w:t>
-      </w:r>
-      <w:r>
-        <w:rPr>
-          <w:rtl w:val="0"/>
-        </w:rPr>
+        <w:t>Cross-check note: mint proceeds reconcile to 288,045 MON: 234,765 MON direct plus 53,280 MON router/internal. The likely-royalties CSV sums to 78,483.61 MON across 241 matched rows.</w:t>
       </w:r>
     </w:p>
     <w:bookmarkStart w:colFirst="0" w:colLast="0" w:name="j5airjqnjdpv" w:id="8"/>

</xml_diff>

<commit_message>
Add lock contract source and test evidence
</commit_message>
<xml_diff>
--- a/r3tards-transparency.docx
+++ b/r3tards-transparency.docx
@@ -2093,12 +2093,8 @@
             <w:vAlign w:val="center"/>
           </w:tcPr>
           <w:p>
-            <w:pPr>
-              <w:jc w:val="right"/>
-              <w:rPr/>
-            </w:pPr>
-            <w:r>
-              <w:t>35 NFTs held by lock contract; unlock rules not proven in repo</w:t>
+            <w:r>
+              <w:t>35 NFTs held by lock contract; source/test evidence added</w:t>
             </w:r>
           </w:p>
         </w:tc>
@@ -3884,12 +3880,8 @@
             <w:vAlign w:val="center"/>
           </w:tcPr>
           <w:p>
-            <w:pPr>
-              <w:jc w:val="left"/>
-              <w:rPr/>
-            </w:pPr>
-            <w:r>
-              <w:t>35 NFTs held by lock contract; unlock rules not proven in repo</w:t>
+            <w:r>
+              <w:t>35 NFTs held; source defines 3-year-plus-1-day timelock and owner-only withdrawals</w:t>
             </w:r>
           </w:p>
         </w:tc>
@@ -4221,44 +4213,12 @@
             <w:vAlign w:val="center"/>
           </w:tcPr>
           <w:p>
-            <w:pPr>
-              <w:spacing w:after="30" w:lineRule="auto"/>
-              <w:jc w:val="center"/>
-              <w:rPr/>
-            </w:pPr>
-            <w:r>
-              <w:rPr>
-                <w:rFonts w:ascii="IBM Plex Mono" w:cs="IBM Plex Mono" w:eastAsia="IBM Plex Mono" w:hAnsi="IBM Plex Mono"/>
-                <w:b w:val="1"/>
-                <w:bCs w:val="1"/>
-                <w:color w:val="6b6478"/>
-                <w:sz w:val="15"/>
-                <w:szCs w:val="15"/>
-                <w:rtl w:val="0"/>
-              </w:rPr>
-              <w:t xml:space="preserve">LOCKED TEAM SUPPLY</w:t>
-            </w:r>
-            <w:r>
-              <w:rPr>
-                <w:rtl w:val="0"/>
-              </w:rPr>
-            </w:r>
-          </w:p>
-          <w:p>
-            <w:pPr>
-              <w:spacing w:after="40" w:lineRule="auto"/>
-              <w:rPr/>
-            </w:pPr>
-            <w:r>
+            <w:r>
+              <w:t>LOCKED TEAM SUPPLY</w:t>
+              <w:br/>
               <w:t>35 NFTs held</w:t>
-            </w:r>
-          </w:p>
-          <w:p>
-            <w:pPr>
-              <w:rPr/>
-            </w:pPr>
-            <w:r>
-              <w:t>Verified current holding at snapshot. Unlock date/rules require decoded contract proof.</w:t>
+              <w:br/>
+              <w:t>Current holding verified at snapshot. Source + 31/31 Foundry tests document lock rules.</w:t>
             </w:r>
           </w:p>
         </w:tc>
@@ -15878,6 +15838,232 @@
         <w:rPr>
           <w:rtl w:val="0"/>
         </w:rPr>
+      </w:r>
+    </w:p>
+    <w:p>
+      <w:r>
+        <w:br w:type="page"/>
+      </w:r>
+    </w:p>
+    <w:p>
+      <w:r>
+        <w:rPr>
+          <w:b/>
+          <w:sz w:val="32"/>
+        </w:rPr>
+        <w:t>G. Lock contract source and tests</w:t>
+      </w:r>
+    </w:p>
+    <w:p>
+      <w:r>
+        <w:rPr>
+          <w:b w:val="0"/>
+        </w:rPr>
+        <w:t xml:space="preserve">The repository now includes the provided NFTTimeLock source, deterministic Foundry tests, and recorded test output for the locked/team supply contract. </w:t>
+      </w:r>
+      <w:r>
+        <w:rPr>
+          <w:b/>
+        </w:rPr>
+        <w:t>This strengthens the lock documentation while keeping custody proof and source/test proof separate.</w:t>
+      </w:r>
+    </w:p>
+    <w:tbl>
+      <w:tblPr>
+        <w:tblW w:type="auto" w:w="0"/>
+        <w:jc w:val="center"/>
+        <w:tblLook w:firstColumn="1" w:firstRow="1" w:lastColumn="0" w:lastRow="0" w:noHBand="0" w:noVBand="1" w:val="04A0"/>
+      </w:tblPr>
+      <w:tblGrid>
+        <w:gridCol w:w="4680"/>
+        <w:gridCol w:w="4680"/>
+      </w:tblGrid>
+      <w:tr>
+        <w:tc>
+          <w:tcPr>
+            <w:tcW w:type="dxa" w:w="4680"/>
+          </w:tcPr>
+          <w:p>
+            <w:r>
+              <w:t>Item</w:t>
+            </w:r>
+          </w:p>
+        </w:tc>
+        <w:tc>
+          <w:tcPr>
+            <w:tcW w:type="dxa" w:w="4680"/>
+          </w:tcPr>
+          <w:p>
+            <w:r>
+              <w:t>Evidence</w:t>
+            </w:r>
+          </w:p>
+        </w:tc>
+      </w:tr>
+      <w:tr>
+        <w:tc>
+          <w:tcPr>
+            <w:tcW w:type="dxa" w:w="4680"/>
+          </w:tcPr>
+          <w:p>
+            <w:r>
+              <w:t>Lock contract address</w:t>
+            </w:r>
+          </w:p>
+        </w:tc>
+        <w:tc>
+          <w:tcPr>
+            <w:tcW w:type="dxa" w:w="4680"/>
+          </w:tcPr>
+          <w:p>
+            <w:r>
+              <w:t>0xec823eAffA4584f482a0d9c3E634840d14066242</w:t>
+            </w:r>
+          </w:p>
+        </w:tc>
+      </w:tr>
+      <w:tr>
+        <w:tc>
+          <w:tcPr>
+            <w:tcW w:type="dxa" w:w="4680"/>
+          </w:tcPr>
+          <w:p>
+            <w:r>
+              <w:t>Current lock custody proof</w:t>
+            </w:r>
+          </w:p>
+        </w:tc>
+        <w:tc>
+          <w:tcPr>
+            <w:tcW w:type="dxa" w:w="4680"/>
+          </w:tcPr>
+          <w:p>
+            <w:r>
+              <w:t>35 NFTs verified as owned by the lock contract at snapshot block 77,822,541</w:t>
+            </w:r>
+          </w:p>
+        </w:tc>
+      </w:tr>
+      <w:tr>
+        <w:tc>
+          <w:tcPr>
+            <w:tcW w:type="dxa" w:w="4680"/>
+          </w:tcPr>
+          <w:p>
+            <w:r>
+              <w:t>Source file</w:t>
+            </w:r>
+          </w:p>
+        </w:tc>
+        <w:tc>
+          <w:tcPr>
+            <w:tcW w:type="dxa" w:w="4680"/>
+          </w:tcPr>
+          <w:p>
+            <w:r>
+              <w:t>r3tards-locked-supply-audit/contracts/NFTTimeLock.sol</w:t>
+            </w:r>
+          </w:p>
+        </w:tc>
+      </w:tr>
+      <w:tr>
+        <w:tc>
+          <w:tcPr>
+            <w:tcW w:type="dxa" w:w="4680"/>
+          </w:tcPr>
+          <w:p>
+            <w:r>
+              <w:t>Test file</w:t>
+            </w:r>
+          </w:p>
+        </w:tc>
+        <w:tc>
+          <w:tcPr>
+            <w:tcW w:type="dxa" w:w="4680"/>
+          </w:tcPr>
+          <w:p>
+            <w:r>
+              <w:t>r3tards-locked-supply-audit/test/NFTTimeLockTest.t.sol</w:t>
+            </w:r>
+          </w:p>
+        </w:tc>
+      </w:tr>
+      <w:tr>
+        <w:tc>
+          <w:tcPr>
+            <w:tcW w:type="dxa" w:w="4680"/>
+          </w:tcPr>
+          <w:p>
+            <w:r>
+              <w:t>Foundry test result</w:t>
+            </w:r>
+          </w:p>
+        </w:tc>
+        <w:tc>
+          <w:tcPr>
+            <w:tcW w:type="dxa" w:w="4680"/>
+          </w:tcPr>
+          <w:p>
+            <w:r>
+              <w:t>31 passed, 0 failed, 0 skipped</w:t>
+            </w:r>
+          </w:p>
+        </w:tc>
+      </w:tr>
+      <w:tr>
+        <w:tc>
+          <w:tcPr>
+            <w:tcW w:type="dxa" w:w="4680"/>
+          </w:tcPr>
+          <w:p>
+            <w:r>
+              <w:t>Test gist</w:t>
+            </w:r>
+          </w:p>
+        </w:tc>
+        <w:tc>
+          <w:tcPr>
+            <w:tcW w:type="dxa" w:w="4680"/>
+          </w:tcPr>
+          <w:p>
+            <w:r>
+              <w:t>https://gist.github.com/dreiki-nft/20fb15e674c2439e26f0f302a70edaa6</w:t>
+            </w:r>
+          </w:p>
+        </w:tc>
+      </w:tr>
+    </w:tbl>
+    <w:p>
+      <w:r>
+        <w:rPr>
+          <w:b/>
+        </w:rPr>
+        <w:t xml:space="preserve">Source-level rules documented: </w:t>
+      </w:r>
+      <w:r>
+        <w:t>the provided contract stores four owner addresses, stores the NFT contract in the constructor, sets unlockTime to deployment timestamp plus 3 years and 1 day, and restricts withdrawNFT / withdrawMultipleNFTs with onlyOwner and onlyAfterUnlock.</w:t>
+      </w:r>
+    </w:p>
+    <w:p>
+      <w:r>
+        <w:rPr>
+          <w:b/>
+        </w:rPr>
+        <w:t xml:space="preserve">Proof boundary: </w:t>
+      </w:r>
+      <w:r>
+        <w:t>the source and tests prove the behavior of the provided source. The token custody proof verifies that the lock contract holds 35 NFTs at the snapshot. Exact deployed unlockTime and bytecode/source equivalence can be checked separately with the included read-only RPC script, verify-lock-contract-state.mjs.</w:t>
+      </w:r>
+    </w:p>
+    <w:p>
+      <w:r>
+        <w:rPr>
+          <w:b/>
+        </w:rPr>
+        <w:t xml:space="preserve">Read-only command: </w:t>
+      </w:r>
+      <w:r>
+        <w:t>cd r3tards-locked-supply-audit &amp;&amp; npm install --ignore-scripts &amp;&amp; RPC_URL="https://rpc.monad.xyz" SNAPSHOT_BLOCK=77822541 npm run fetch:state</w:t>
       </w:r>
     </w:p>
     <w:sectPr>

</xml_diff>